<commit_message>
JSS revision: address reviewer report (M1-M7, minors, language); submission-ready zip
Co-Authored-By: Claude Opus 5.5 <noreply@anthropic.com>
Claude-Session: https://claude.ai/code/session_012xAbNsXxqpSDNHnoo6TEqU
</commit_message>
<xml_diff>
--- a/psao-artifact/paper/jss-submission/submission-files/highlights.docx
+++ b/psao-artifact/paper/jss-submission/submission-files/highlights.docx
@@ -31,7 +31,7 @@
         <w:pStyle w:val="ListBullet"/>
       </w:pPr>
       <w:r>
-        <w:t>The bundled OpenSSL release sets its price: 394 µs on 3.0.16, 8.4 µs on 3.5.8</w:t>
+        <w:t>Its price follows OpenSSL: the same C calls cost 394 µs on 3.0.16, 8.4 µs on 3.5.8</w:t>
       </w:r>
     </w:p>
     <w:p>
@@ -39,7 +39,7 @@
         <w:pStyle w:val="ListBullet"/>
       </w:pPr>
       <w:r>
-        <w:t>Of seven JWT libraries in 4 languages, only one attempts the parse: a design choice</w:t>
+        <w:t>Ubuntu 24.04's own Node.js, on system OpenSSL 3.0, still pays the slow price</w:t>
       </w:r>
     </w:p>
     <w:p>

</xml_diff>